<commit_message>
porque no me deja hacer pussssh
</commit_message>
<xml_diff>
--- a/Ingenieria_Sistemas/Administracion_Gestion_BasesDatos/Práctica Guiada Base de Datos Distribuidas.docx
+++ b/Ingenieria_Sistemas/Administracion_Gestion_BasesDatos/Práctica Guiada Base de Datos Distribuidas.docx
@@ -434,57 +434,17 @@
           <w:lang w:eastAsia="es-ES"/>
         </w:rPr>
         <w:br/>
-        <w:t xml:space="preserve">    Nombre </w:t>
-      </w:r>
-      <w:proofErr w:type="gramStart"/>
-      <w:r>
-        <w:rPr>
-          <w:rFonts w:ascii="Courier New" w:eastAsia="Times New Roman" w:hAnsi="Courier New" w:cs="Courier New"/>
-          <w:sz w:val="20"/>
-          <w:szCs w:val="20"/>
-          <w:lang w:eastAsia="es-ES"/>
-        </w:rPr>
-        <w:t>VARCHAR(</w:t>
-      </w:r>
-      <w:proofErr w:type="gramEnd"/>
-      <w:r>
-        <w:rPr>
-          <w:rFonts w:ascii="Courier New" w:eastAsia="Times New Roman" w:hAnsi="Courier New" w:cs="Courier New"/>
-          <w:sz w:val="20"/>
-          <w:szCs w:val="20"/>
-          <w:lang w:eastAsia="es-ES"/>
-        </w:rPr>
-        <w:t>100),</w:t>
-      </w:r>
-      <w:r>
-        <w:rPr>
-          <w:rFonts w:ascii="Courier New" w:eastAsia="Times New Roman" w:hAnsi="Courier New" w:cs="Courier New"/>
-          <w:sz w:val="20"/>
-          <w:szCs w:val="20"/>
-          <w:lang w:eastAsia="es-ES"/>
-        </w:rPr>
-        <w:br/>
-        <w:t xml:space="preserve">    Ciudad </w:t>
-      </w:r>
-      <w:proofErr w:type="gramStart"/>
-      <w:r>
-        <w:rPr>
-          <w:rFonts w:ascii="Courier New" w:eastAsia="Times New Roman" w:hAnsi="Courier New" w:cs="Courier New"/>
-          <w:sz w:val="20"/>
-          <w:szCs w:val="20"/>
-          <w:lang w:eastAsia="es-ES"/>
-        </w:rPr>
-        <w:t>VARCHAR(</w:t>
-      </w:r>
-      <w:proofErr w:type="gramEnd"/>
-      <w:r>
-        <w:rPr>
-          <w:rFonts w:ascii="Courier New" w:eastAsia="Times New Roman" w:hAnsi="Courier New" w:cs="Courier New"/>
-          <w:sz w:val="20"/>
-          <w:szCs w:val="20"/>
-          <w:lang w:eastAsia="es-ES"/>
-        </w:rPr>
-        <w:t>100)</w:t>
+        <w:t xml:space="preserve">    Nombre VARCHAR(100),</w:t>
+      </w:r>
+      <w:r>
+        <w:rPr>
+          <w:rFonts w:ascii="Courier New" w:eastAsia="Times New Roman" w:hAnsi="Courier New" w:cs="Courier New"/>
+          <w:sz w:val="20"/>
+          <w:szCs w:val="20"/>
+          <w:lang w:eastAsia="es-ES"/>
+        </w:rPr>
+        <w:br/>
+        <w:t xml:space="preserve">    Ciudad VARCHAR(100)</w:t>
       </w:r>
       <w:r>
         <w:rPr>
@@ -553,57 +513,17 @@
           <w:lang w:eastAsia="es-ES"/>
         </w:rPr>
         <w:br/>
-        <w:t xml:space="preserve">    Nombre </w:t>
-      </w:r>
-      <w:proofErr w:type="gramStart"/>
-      <w:r>
-        <w:rPr>
-          <w:rFonts w:ascii="Courier New" w:eastAsia="Times New Roman" w:hAnsi="Courier New" w:cs="Courier New"/>
-          <w:sz w:val="20"/>
-          <w:szCs w:val="20"/>
-          <w:lang w:eastAsia="es-ES"/>
-        </w:rPr>
-        <w:t>VARCHAR(</w:t>
-      </w:r>
-      <w:proofErr w:type="gramEnd"/>
-      <w:r>
-        <w:rPr>
-          <w:rFonts w:ascii="Courier New" w:eastAsia="Times New Roman" w:hAnsi="Courier New" w:cs="Courier New"/>
-          <w:sz w:val="20"/>
-          <w:szCs w:val="20"/>
-          <w:lang w:eastAsia="es-ES"/>
-        </w:rPr>
-        <w:t>100),</w:t>
-      </w:r>
-      <w:r>
-        <w:rPr>
-          <w:rFonts w:ascii="Courier New" w:eastAsia="Times New Roman" w:hAnsi="Courier New" w:cs="Courier New"/>
-          <w:sz w:val="20"/>
-          <w:szCs w:val="20"/>
-          <w:lang w:eastAsia="es-ES"/>
-        </w:rPr>
-        <w:br/>
-        <w:t xml:space="preserve">    Precio </w:t>
-      </w:r>
-      <w:proofErr w:type="gramStart"/>
-      <w:r>
-        <w:rPr>
-          <w:rFonts w:ascii="Courier New" w:eastAsia="Times New Roman" w:hAnsi="Courier New" w:cs="Courier New"/>
-          <w:sz w:val="20"/>
-          <w:szCs w:val="20"/>
-          <w:lang w:eastAsia="es-ES"/>
-        </w:rPr>
-        <w:t>DECIMAL(</w:t>
-      </w:r>
-      <w:proofErr w:type="gramEnd"/>
-      <w:r>
-        <w:rPr>
-          <w:rFonts w:ascii="Courier New" w:eastAsia="Times New Roman" w:hAnsi="Courier New" w:cs="Courier New"/>
-          <w:sz w:val="20"/>
-          <w:szCs w:val="20"/>
-          <w:lang w:eastAsia="es-ES"/>
-        </w:rPr>
-        <w:t>10,2)</w:t>
+        <w:t xml:space="preserve">    Nombre VARCHAR(100),</w:t>
+      </w:r>
+      <w:r>
+        <w:rPr>
+          <w:rFonts w:ascii="Courier New" w:eastAsia="Times New Roman" w:hAnsi="Courier New" w:cs="Courier New"/>
+          <w:sz w:val="20"/>
+          <w:szCs w:val="20"/>
+          <w:lang w:eastAsia="es-ES"/>
+        </w:rPr>
+        <w:br/>
+        <w:t xml:space="preserve">    Precio DECIMAL(10,2)</w:t>
       </w:r>
       <w:r>
         <w:rPr>
@@ -732,20 +652,9 @@
           <w:szCs w:val="20"/>
           <w:lang w:eastAsia="es-ES"/>
         </w:rPr>
-        <w:t xml:space="preserve">) REFERENCES </w:t>
-      </w:r>
-      <w:proofErr w:type="gramStart"/>
-      <w:r>
-        <w:rPr>
-          <w:rFonts w:ascii="Courier New" w:eastAsia="Times New Roman" w:hAnsi="Courier New" w:cs="Courier New"/>
-          <w:sz w:val="20"/>
-          <w:szCs w:val="20"/>
-          <w:lang w:eastAsia="es-ES"/>
-        </w:rPr>
-        <w:t>Clientes(</w:t>
+        <w:t>) REFERENCES Clientes(</w:t>
       </w:r>
       <w:proofErr w:type="spellStart"/>
-      <w:proofErr w:type="gramEnd"/>
       <w:r>
         <w:rPr>
           <w:rFonts w:ascii="Courier New" w:eastAsia="Times New Roman" w:hAnsi="Courier New" w:cs="Courier New"/>
@@ -930,57 +839,17 @@
           <w:lang w:eastAsia="es-ES"/>
         </w:rPr>
         <w:br/>
-        <w:t xml:space="preserve">    Nombre </w:t>
-      </w:r>
-      <w:proofErr w:type="gramStart"/>
-      <w:r>
-        <w:rPr>
-          <w:rFonts w:ascii="Courier New" w:eastAsia="Times New Roman" w:hAnsi="Courier New" w:cs="Courier New"/>
-          <w:sz w:val="20"/>
-          <w:szCs w:val="20"/>
-          <w:lang w:eastAsia="es-ES"/>
-        </w:rPr>
-        <w:t>VARCHAR(</w:t>
-      </w:r>
-      <w:proofErr w:type="gramEnd"/>
-      <w:r>
-        <w:rPr>
-          <w:rFonts w:ascii="Courier New" w:eastAsia="Times New Roman" w:hAnsi="Courier New" w:cs="Courier New"/>
-          <w:sz w:val="20"/>
-          <w:szCs w:val="20"/>
-          <w:lang w:eastAsia="es-ES"/>
-        </w:rPr>
-        <w:t>100),</w:t>
-      </w:r>
-      <w:r>
-        <w:rPr>
-          <w:rFonts w:ascii="Courier New" w:eastAsia="Times New Roman" w:hAnsi="Courier New" w:cs="Courier New"/>
-          <w:sz w:val="20"/>
-          <w:szCs w:val="20"/>
-          <w:lang w:eastAsia="es-ES"/>
-        </w:rPr>
-        <w:br/>
-        <w:t xml:space="preserve">    Ciudad </w:t>
-      </w:r>
-      <w:proofErr w:type="gramStart"/>
-      <w:r>
-        <w:rPr>
-          <w:rFonts w:ascii="Courier New" w:eastAsia="Times New Roman" w:hAnsi="Courier New" w:cs="Courier New"/>
-          <w:sz w:val="20"/>
-          <w:szCs w:val="20"/>
-          <w:lang w:eastAsia="es-ES"/>
-        </w:rPr>
-        <w:t>VARCHAR(</w:t>
-      </w:r>
-      <w:proofErr w:type="gramEnd"/>
-      <w:r>
-        <w:rPr>
-          <w:rFonts w:ascii="Courier New" w:eastAsia="Times New Roman" w:hAnsi="Courier New" w:cs="Courier New"/>
-          <w:sz w:val="20"/>
-          <w:szCs w:val="20"/>
-          <w:lang w:eastAsia="es-ES"/>
-        </w:rPr>
-        <w:t>100)</w:t>
+        <w:t xml:space="preserve">    Nombre VARCHAR(100),</w:t>
+      </w:r>
+      <w:r>
+        <w:rPr>
+          <w:rFonts w:ascii="Courier New" w:eastAsia="Times New Roman" w:hAnsi="Courier New" w:cs="Courier New"/>
+          <w:sz w:val="20"/>
+          <w:szCs w:val="20"/>
+          <w:lang w:eastAsia="es-ES"/>
+        </w:rPr>
+        <w:br/>
+        <w:t xml:space="preserve">    Ciudad VARCHAR(100)</w:t>
       </w:r>
       <w:r>
         <w:rPr>
@@ -1049,57 +918,17 @@
           <w:lang w:eastAsia="es-ES"/>
         </w:rPr>
         <w:br/>
-        <w:t xml:space="preserve">    Nombre </w:t>
-      </w:r>
-      <w:proofErr w:type="gramStart"/>
-      <w:r>
-        <w:rPr>
-          <w:rFonts w:ascii="Courier New" w:eastAsia="Times New Roman" w:hAnsi="Courier New" w:cs="Courier New"/>
-          <w:sz w:val="20"/>
-          <w:szCs w:val="20"/>
-          <w:lang w:eastAsia="es-ES"/>
-        </w:rPr>
-        <w:t>VARCHAR(</w:t>
-      </w:r>
-      <w:proofErr w:type="gramEnd"/>
-      <w:r>
-        <w:rPr>
-          <w:rFonts w:ascii="Courier New" w:eastAsia="Times New Roman" w:hAnsi="Courier New" w:cs="Courier New"/>
-          <w:sz w:val="20"/>
-          <w:szCs w:val="20"/>
-          <w:lang w:eastAsia="es-ES"/>
-        </w:rPr>
-        <w:t>100),</w:t>
-      </w:r>
-      <w:r>
-        <w:rPr>
-          <w:rFonts w:ascii="Courier New" w:eastAsia="Times New Roman" w:hAnsi="Courier New" w:cs="Courier New"/>
-          <w:sz w:val="20"/>
-          <w:szCs w:val="20"/>
-          <w:lang w:eastAsia="es-ES"/>
-        </w:rPr>
-        <w:br/>
-        <w:t xml:space="preserve">    Precio </w:t>
-      </w:r>
-      <w:proofErr w:type="gramStart"/>
-      <w:r>
-        <w:rPr>
-          <w:rFonts w:ascii="Courier New" w:eastAsia="Times New Roman" w:hAnsi="Courier New" w:cs="Courier New"/>
-          <w:sz w:val="20"/>
-          <w:szCs w:val="20"/>
-          <w:lang w:eastAsia="es-ES"/>
-        </w:rPr>
-        <w:t>DECIMAL(</w:t>
-      </w:r>
-      <w:proofErr w:type="gramEnd"/>
-      <w:r>
-        <w:rPr>
-          <w:rFonts w:ascii="Courier New" w:eastAsia="Times New Roman" w:hAnsi="Courier New" w:cs="Courier New"/>
-          <w:sz w:val="20"/>
-          <w:szCs w:val="20"/>
-          <w:lang w:eastAsia="es-ES"/>
-        </w:rPr>
-        <w:t>10,2)</w:t>
+        <w:t xml:space="preserve">    Nombre VARCHAR(100),</w:t>
+      </w:r>
+      <w:r>
+        <w:rPr>
+          <w:rFonts w:ascii="Courier New" w:eastAsia="Times New Roman" w:hAnsi="Courier New" w:cs="Courier New"/>
+          <w:sz w:val="20"/>
+          <w:szCs w:val="20"/>
+          <w:lang w:eastAsia="es-ES"/>
+        </w:rPr>
+        <w:br/>
+        <w:t xml:space="preserve">    Precio DECIMAL(10,2)</w:t>
       </w:r>
       <w:r>
         <w:rPr>
@@ -1228,20 +1057,9 @@
           <w:szCs w:val="20"/>
           <w:lang w:eastAsia="es-ES"/>
         </w:rPr>
-        <w:t xml:space="preserve">) REFERENCES </w:t>
-      </w:r>
-      <w:proofErr w:type="gramStart"/>
-      <w:r>
-        <w:rPr>
-          <w:rFonts w:ascii="Courier New" w:eastAsia="Times New Roman" w:hAnsi="Courier New" w:cs="Courier New"/>
-          <w:sz w:val="20"/>
-          <w:szCs w:val="20"/>
-          <w:lang w:eastAsia="es-ES"/>
-        </w:rPr>
-        <w:t>Clientes(</w:t>
+        <w:t>) REFERENCES Clientes(</w:t>
       </w:r>
       <w:proofErr w:type="spellStart"/>
-      <w:proofErr w:type="gramEnd"/>
       <w:r>
         <w:rPr>
           <w:rFonts w:ascii="Courier New" w:eastAsia="Times New Roman" w:hAnsi="Courier New" w:cs="Courier New"/>
@@ -1947,7 +1765,6 @@
         <w:t xml:space="preserve">SELECT </w:t>
       </w:r>
       <w:proofErr w:type="spellStart"/>
-      <w:proofErr w:type="gramStart"/>
       <w:r>
         <w:rPr>
           <w:rFonts w:ascii="Courier New" w:eastAsia="Times New Roman" w:hAnsi="Courier New" w:cs="Courier New"/>
@@ -1958,7 +1775,6 @@
         <w:t>v.IdVenta</w:t>
       </w:r>
       <w:proofErr w:type="spellEnd"/>
-      <w:proofErr w:type="gramEnd"/>
       <w:r>
         <w:rPr>
           <w:rFonts w:ascii="Courier New" w:eastAsia="Times New Roman" w:hAnsi="Courier New" w:cs="Courier New"/>
@@ -1969,7 +1785,6 @@
         <w:t xml:space="preserve">, </w:t>
       </w:r>
       <w:proofErr w:type="spellStart"/>
-      <w:proofErr w:type="gramStart"/>
       <w:r>
         <w:rPr>
           <w:rFonts w:ascii="Courier New" w:eastAsia="Times New Roman" w:hAnsi="Courier New" w:cs="Courier New"/>
@@ -1980,7 +1795,6 @@
         <w:t>v.Fecha</w:t>
       </w:r>
       <w:proofErr w:type="spellEnd"/>
-      <w:proofErr w:type="gramEnd"/>
       <w:r>
         <w:rPr>
           <w:rFonts w:ascii="Courier New" w:eastAsia="Times New Roman" w:hAnsi="Courier New" w:cs="Courier New"/>
@@ -1991,7 +1805,6 @@
         <w:t xml:space="preserve">, </w:t>
       </w:r>
       <w:proofErr w:type="spellStart"/>
-      <w:proofErr w:type="gramStart"/>
       <w:r>
         <w:rPr>
           <w:rFonts w:ascii="Courier New" w:eastAsia="Times New Roman" w:hAnsi="Courier New" w:cs="Courier New"/>
@@ -2002,7 +1815,6 @@
         <w:t>c.Nombre</w:t>
       </w:r>
       <w:proofErr w:type="spellEnd"/>
-      <w:proofErr w:type="gramEnd"/>
       <w:r>
         <w:rPr>
           <w:rFonts w:ascii="Courier New" w:eastAsia="Times New Roman" w:hAnsi="Courier New" w:cs="Courier New"/>
@@ -2074,7 +1886,6 @@
         <w:t xml:space="preserve">ON </w:t>
       </w:r>
       <w:proofErr w:type="spellStart"/>
-      <w:proofErr w:type="gramStart"/>
       <w:r>
         <w:rPr>
           <w:rFonts w:ascii="Courier New" w:eastAsia="Times New Roman" w:hAnsi="Courier New" w:cs="Courier New"/>
@@ -2085,7 +1896,6 @@
         <w:t>v.IdCliente</w:t>
       </w:r>
       <w:proofErr w:type="spellEnd"/>
-      <w:proofErr w:type="gramEnd"/>
       <w:r>
         <w:rPr>
           <w:rFonts w:ascii="Courier New" w:eastAsia="Times New Roman" w:hAnsi="Courier New" w:cs="Courier New"/>
@@ -2096,7 +1906,6 @@
         <w:t xml:space="preserve"> = </w:t>
       </w:r>
       <w:proofErr w:type="spellStart"/>
-      <w:proofErr w:type="gramStart"/>
       <w:r>
         <w:rPr>
           <w:rFonts w:ascii="Courier New" w:eastAsia="Times New Roman" w:hAnsi="Courier New" w:cs="Courier New"/>
@@ -2107,7 +1916,6 @@
         <w:t>c.IdCliente</w:t>
       </w:r>
       <w:proofErr w:type="spellEnd"/>
-      <w:proofErr w:type="gramEnd"/>
       <w:r>
         <w:rPr>
           <w:rFonts w:ascii="Courier New" w:eastAsia="Times New Roman" w:hAnsi="Courier New" w:cs="Courier New"/>
@@ -2147,7 +1955,6 @@
         <w:t xml:space="preserve">SELECT </w:t>
       </w:r>
       <w:proofErr w:type="spellStart"/>
-      <w:proofErr w:type="gramStart"/>
       <w:r>
         <w:rPr>
           <w:rFonts w:ascii="Courier New" w:eastAsia="Times New Roman" w:hAnsi="Courier New" w:cs="Courier New"/>
@@ -2158,7 +1965,6 @@
         <w:t>v.IdVenta</w:t>
       </w:r>
       <w:proofErr w:type="spellEnd"/>
-      <w:proofErr w:type="gramEnd"/>
       <w:r>
         <w:rPr>
           <w:rFonts w:ascii="Courier New" w:eastAsia="Times New Roman" w:hAnsi="Courier New" w:cs="Courier New"/>
@@ -2169,7 +1975,6 @@
         <w:t xml:space="preserve">, </w:t>
       </w:r>
       <w:proofErr w:type="spellStart"/>
-      <w:proofErr w:type="gramStart"/>
       <w:r>
         <w:rPr>
           <w:rFonts w:ascii="Courier New" w:eastAsia="Times New Roman" w:hAnsi="Courier New" w:cs="Courier New"/>
@@ -2180,7 +1985,6 @@
         <w:t>v.Fecha</w:t>
       </w:r>
       <w:proofErr w:type="spellEnd"/>
-      <w:proofErr w:type="gramEnd"/>
       <w:r>
         <w:rPr>
           <w:rFonts w:ascii="Courier New" w:eastAsia="Times New Roman" w:hAnsi="Courier New" w:cs="Courier New"/>
@@ -2191,7 +1995,6 @@
         <w:t xml:space="preserve">, </w:t>
       </w:r>
       <w:proofErr w:type="spellStart"/>
-      <w:proofErr w:type="gramStart"/>
       <w:r>
         <w:rPr>
           <w:rFonts w:ascii="Courier New" w:eastAsia="Times New Roman" w:hAnsi="Courier New" w:cs="Courier New"/>
@@ -2202,7 +2005,6 @@
         <w:t>c.Nombre</w:t>
       </w:r>
       <w:proofErr w:type="spellEnd"/>
-      <w:proofErr w:type="gramEnd"/>
       <w:r>
         <w:rPr>
           <w:rFonts w:ascii="Courier New" w:eastAsia="Times New Roman" w:hAnsi="Courier New" w:cs="Courier New"/>
@@ -2274,7 +2076,6 @@
         <w:t xml:space="preserve">ON </w:t>
       </w:r>
       <w:proofErr w:type="spellStart"/>
-      <w:proofErr w:type="gramStart"/>
       <w:r>
         <w:rPr>
           <w:rFonts w:ascii="Courier New" w:eastAsia="Times New Roman" w:hAnsi="Courier New" w:cs="Courier New"/>
@@ -2285,7 +2086,6 @@
         <w:t>v.IdCliente</w:t>
       </w:r>
       <w:proofErr w:type="spellEnd"/>
-      <w:proofErr w:type="gramEnd"/>
       <w:r>
         <w:rPr>
           <w:rFonts w:ascii="Courier New" w:eastAsia="Times New Roman" w:hAnsi="Courier New" w:cs="Courier New"/>
@@ -2296,7 +2096,6 @@
         <w:t xml:space="preserve"> = </w:t>
       </w:r>
       <w:proofErr w:type="spellStart"/>
-      <w:proofErr w:type="gramStart"/>
       <w:r>
         <w:rPr>
           <w:rFonts w:ascii="Courier New" w:eastAsia="Times New Roman" w:hAnsi="Courier New" w:cs="Courier New"/>
@@ -2307,7 +2106,6 @@
         <w:t>c.IdCliente</w:t>
       </w:r>
       <w:proofErr w:type="spellEnd"/>
-      <w:proofErr w:type="gramEnd"/>
       <w:r>
         <w:rPr>
           <w:rFonts w:ascii="Courier New" w:eastAsia="Times New Roman" w:hAnsi="Courier New" w:cs="Courier New"/>
@@ -2468,6 +2266,7 @@
       </w:pPr>
       <w:r>
         <w:rPr>
+          <w:noProof/>
           <w:lang w:eastAsia="es-ES"/>
         </w:rPr>
         <w:drawing>
@@ -2522,6 +2321,7 @@
       </w:pPr>
       <w:r>
         <w:rPr>
+          <w:noProof/>
           <w:lang w:eastAsia="es-ES"/>
         </w:rPr>
         <w:lastRenderedPageBreak/>
@@ -2570,6 +2370,7 @@
       </w:pPr>
       <w:r>
         <w:rPr>
+          <w:noProof/>
           <w:lang w:eastAsia="es-ES"/>
         </w:rPr>
         <w:drawing>
@@ -2617,6 +2418,7 @@
       </w:pPr>
       <w:r>
         <w:rPr>
+          <w:noProof/>
           <w:lang w:eastAsia="es-ES"/>
         </w:rPr>
         <w:lastRenderedPageBreak/>
@@ -2665,6 +2467,7 @@
       </w:pPr>
       <w:r>
         <w:rPr>
+          <w:noProof/>
           <w:lang w:eastAsia="es-ES"/>
         </w:rPr>
         <w:lastRenderedPageBreak/>
@@ -2713,6 +2516,7 @@
       </w:pPr>
       <w:r>
         <w:rPr>
+          <w:noProof/>
           <w:lang w:eastAsia="es-ES"/>
         </w:rPr>
         <w:lastRenderedPageBreak/>
@@ -2761,6 +2565,7 @@
       </w:pPr>
       <w:r>
         <w:rPr>
+          <w:noProof/>
           <w:lang w:eastAsia="es-ES"/>
         </w:rPr>
         <w:lastRenderedPageBreak/>
@@ -2809,6 +2614,7 @@
       </w:pPr>
       <w:r>
         <w:rPr>
+          <w:noProof/>
           <w:lang w:eastAsia="es-ES"/>
         </w:rPr>
         <w:drawing>
@@ -2856,6 +2662,7 @@
       </w:pPr>
       <w:r>
         <w:rPr>
+          <w:noProof/>
           <w:lang w:eastAsia="es-ES"/>
         </w:rPr>
         <w:drawing>
@@ -2903,6 +2710,7 @@
       </w:pPr>
       <w:r>
         <w:rPr>
+          <w:noProof/>
           <w:lang w:eastAsia="es-ES"/>
         </w:rPr>
         <w:lastRenderedPageBreak/>
@@ -2951,6 +2759,7 @@
       </w:pPr>
       <w:r>
         <w:rPr>
+          <w:noProof/>
           <w:lang w:eastAsia="es-ES"/>
         </w:rPr>
         <w:drawing>
@@ -3052,6 +2861,141 @@
     </w:p>
     <w:p>
       <w:pPr>
+        <w:spacing w:before="100" w:beforeAutospacing="1" w:after="100" w:afterAutospacing="1" w:line="240" w:lineRule="auto"/>
+        <w:ind w:left="720"/>
+        <w:rPr>
+          <w:rFonts w:ascii="Times New Roman" w:eastAsia="Times New Roman" w:hAnsi="Times New Roman" w:cs="Times New Roman"/>
+          <w:sz w:val="24"/>
+          <w:szCs w:val="24"/>
+          <w:lang w:val="es-419" w:eastAsia="es-ES"/>
+        </w:rPr>
+      </w:pPr>
+      <w:r>
+        <w:rPr>
+          <w:rFonts w:ascii="Times New Roman" w:eastAsia="Times New Roman" w:hAnsi="Times New Roman" w:cs="Times New Roman"/>
+          <w:sz w:val="24"/>
+          <w:szCs w:val="24"/>
+          <w:lang w:eastAsia="es-ES"/>
+        </w:rPr>
+        <w:t xml:space="preserve">Respuesta: Se </w:t>
+      </w:r>
+      <w:proofErr w:type="spellStart"/>
+      <w:r>
+        <w:rPr>
+          <w:rFonts w:ascii="Times New Roman" w:eastAsia="Times New Roman" w:hAnsi="Times New Roman" w:cs="Times New Roman"/>
+          <w:sz w:val="24"/>
+          <w:szCs w:val="24"/>
+          <w:lang w:eastAsia="es-ES"/>
+        </w:rPr>
+        <w:t>utiliz</w:t>
+      </w:r>
+      <w:r>
+        <w:rPr>
+          <w:rFonts w:ascii="Times New Roman" w:eastAsia="Times New Roman" w:hAnsi="Times New Roman" w:cs="Times New Roman"/>
+          <w:sz w:val="24"/>
+          <w:szCs w:val="24"/>
+          <w:lang w:val="es-419" w:eastAsia="es-ES"/>
+        </w:rPr>
+        <w:t>ó</w:t>
+      </w:r>
+      <w:proofErr w:type="spellEnd"/>
+      <w:r>
+        <w:rPr>
+          <w:rFonts w:ascii="Times New Roman" w:eastAsia="Times New Roman" w:hAnsi="Times New Roman" w:cs="Times New Roman"/>
+          <w:sz w:val="24"/>
+          <w:szCs w:val="24"/>
+          <w:lang w:val="es-419" w:eastAsia="es-ES"/>
+        </w:rPr>
+        <w:t xml:space="preserve"> fragmentaci</w:t>
+      </w:r>
+      <w:r>
+        <w:rPr>
+          <w:rFonts w:ascii="Times New Roman" w:eastAsia="Times New Roman" w:hAnsi="Times New Roman" w:cs="Times New Roman"/>
+          <w:sz w:val="24"/>
+          <w:szCs w:val="24"/>
+          <w:lang w:val="es-419" w:eastAsia="es-ES"/>
+        </w:rPr>
+        <w:t>ó</w:t>
+      </w:r>
+      <w:r>
+        <w:rPr>
+          <w:rFonts w:ascii="Times New Roman" w:eastAsia="Times New Roman" w:hAnsi="Times New Roman" w:cs="Times New Roman"/>
+          <w:sz w:val="24"/>
+          <w:szCs w:val="24"/>
+          <w:lang w:val="es-419" w:eastAsia="es-ES"/>
+        </w:rPr>
+        <w:t>n h</w:t>
+      </w:r>
+      <w:r>
+        <w:rPr>
+          <w:rFonts w:ascii="Times New Roman" w:eastAsia="Times New Roman" w:hAnsi="Times New Roman" w:cs="Times New Roman"/>
+          <w:sz w:val="24"/>
+          <w:szCs w:val="24"/>
+          <w:lang w:val="es-419" w:eastAsia="es-ES"/>
+        </w:rPr>
+        <w:t>orizontal, ya que los registros de la tabla Ventas se dividieron entre dos bases de datos diferentes (</w:t>
+      </w:r>
+      <w:proofErr w:type="spellStart"/>
+      <w:r>
+        <w:rPr>
+          <w:rFonts w:ascii="Times New Roman" w:eastAsia="Times New Roman" w:hAnsi="Times New Roman" w:cs="Times New Roman"/>
+          <w:sz w:val="24"/>
+          <w:szCs w:val="24"/>
+          <w:lang w:val="es-419" w:eastAsia="es-ES"/>
+        </w:rPr>
+        <w:t>Ventas_Norte</w:t>
+      </w:r>
+      <w:proofErr w:type="spellEnd"/>
+      <w:r>
+        <w:rPr>
+          <w:rFonts w:ascii="Times New Roman" w:eastAsia="Times New Roman" w:hAnsi="Times New Roman" w:cs="Times New Roman"/>
+          <w:sz w:val="24"/>
+          <w:szCs w:val="24"/>
+          <w:lang w:val="es-419" w:eastAsia="es-ES"/>
+        </w:rPr>
+        <w:t xml:space="preserve"> y </w:t>
+      </w:r>
+      <w:proofErr w:type="spellStart"/>
+      <w:r>
+        <w:rPr>
+          <w:rFonts w:ascii="Times New Roman" w:eastAsia="Times New Roman" w:hAnsi="Times New Roman" w:cs="Times New Roman"/>
+          <w:sz w:val="24"/>
+          <w:szCs w:val="24"/>
+          <w:lang w:val="es-419" w:eastAsia="es-ES"/>
+        </w:rPr>
+        <w:t>Ventas_Sur</w:t>
+      </w:r>
+      <w:proofErr w:type="spellEnd"/>
+      <w:r>
+        <w:rPr>
+          <w:rFonts w:ascii="Times New Roman" w:eastAsia="Times New Roman" w:hAnsi="Times New Roman" w:cs="Times New Roman"/>
+          <w:sz w:val="24"/>
+          <w:szCs w:val="24"/>
+          <w:lang w:val="es-419" w:eastAsia="es-ES"/>
+        </w:rPr>
+        <w:t>), manteniendo la misma estructura en ambas. Cada base contiene un subconjunto distinto de filas, lo que simula la distribució</w:t>
+      </w:r>
+      <w:r>
+        <w:rPr>
+          <w:rFonts w:ascii="Times New Roman" w:eastAsia="Times New Roman" w:hAnsi="Times New Roman" w:cs="Times New Roman"/>
+          <w:sz w:val="24"/>
+          <w:szCs w:val="24"/>
+          <w:lang w:val="es-419" w:eastAsia="es-ES"/>
+        </w:rPr>
+        <w:t>n</w:t>
+      </w:r>
+      <w:r>
+        <w:rPr>
+          <w:rFonts w:ascii="Times New Roman" w:eastAsia="Times New Roman" w:hAnsi="Times New Roman" w:cs="Times New Roman"/>
+          <w:sz w:val="24"/>
+          <w:szCs w:val="24"/>
+          <w:lang w:val="es-419" w:eastAsia="es-ES"/>
+        </w:rPr>
+        <w:t xml:space="preserve"> de datos por sucursal</w:t>
+      </w:r>
+    </w:p>
+    <w:p>
+      <w:pPr>
         <w:numPr>
           <w:ilvl w:val="0"/>
           <w:numId w:val="2"/>
@@ -3076,6 +3020,138 @@
     </w:p>
     <w:p>
       <w:pPr>
+        <w:spacing w:before="100" w:beforeAutospacing="1" w:after="100" w:afterAutospacing="1" w:line="240" w:lineRule="auto"/>
+        <w:ind w:left="720"/>
+        <w:rPr>
+          <w:rFonts w:ascii="Times New Roman" w:eastAsia="Times New Roman" w:hAnsi="Times New Roman" w:cs="Times New Roman"/>
+          <w:sz w:val="24"/>
+          <w:szCs w:val="24"/>
+          <w:lang w:val="es-419" w:eastAsia="es-ES"/>
+        </w:rPr>
+      </w:pPr>
+      <w:r>
+        <w:rPr>
+          <w:rFonts w:ascii="Times New Roman" w:eastAsia="Times New Roman" w:hAnsi="Times New Roman" w:cs="Times New Roman"/>
+          <w:sz w:val="24"/>
+          <w:szCs w:val="24"/>
+          <w:lang w:eastAsia="es-ES"/>
+        </w:rPr>
+        <w:t>Respuesta: Este modelo permite distribuir la carga de trabajo, ya que cada sucursal maneja sus propios datos de forma independiente. Adem</w:t>
+      </w:r>
+      <w:proofErr w:type="spellStart"/>
+      <w:r>
+        <w:rPr>
+          <w:rFonts w:ascii="Times New Roman" w:eastAsia="Times New Roman" w:hAnsi="Times New Roman" w:cs="Times New Roman"/>
+          <w:sz w:val="24"/>
+          <w:szCs w:val="24"/>
+          <w:lang w:val="es-419" w:eastAsia="es-ES"/>
+        </w:rPr>
+        <w:t>ás</w:t>
+      </w:r>
+      <w:proofErr w:type="spellEnd"/>
+      <w:r>
+        <w:rPr>
+          <w:rFonts w:ascii="Times New Roman" w:eastAsia="Times New Roman" w:hAnsi="Times New Roman" w:cs="Times New Roman"/>
+          <w:sz w:val="24"/>
+          <w:szCs w:val="24"/>
+          <w:lang w:val="es-419" w:eastAsia="es-ES"/>
+        </w:rPr>
+        <w:t xml:space="preserve">, mejora el </w:t>
+      </w:r>
+      <w:r>
+        <w:rPr>
+          <w:rFonts w:ascii="Times New Roman" w:eastAsia="Times New Roman" w:hAnsi="Times New Roman" w:cs="Times New Roman"/>
+          <w:sz w:val="24"/>
+          <w:szCs w:val="24"/>
+          <w:lang w:val="es-419" w:eastAsia="es-ES"/>
+        </w:rPr>
+        <w:lastRenderedPageBreak/>
+        <w:t>rendimiento en consultas locales, reduce la con</w:t>
+      </w:r>
+      <w:r>
+        <w:rPr>
+          <w:rFonts w:ascii="Times New Roman" w:eastAsia="Times New Roman" w:hAnsi="Times New Roman" w:cs="Times New Roman"/>
+          <w:sz w:val="24"/>
+          <w:szCs w:val="24"/>
+          <w:lang w:val="es-419" w:eastAsia="es-ES"/>
+        </w:rPr>
+        <w:t>gestión</w:t>
+      </w:r>
+      <w:r>
+        <w:rPr>
+          <w:rFonts w:ascii="Times New Roman" w:eastAsia="Times New Roman" w:hAnsi="Times New Roman" w:cs="Times New Roman"/>
+          <w:sz w:val="24"/>
+          <w:szCs w:val="24"/>
+          <w:lang w:val="es-419" w:eastAsia="es-ES"/>
+        </w:rPr>
+        <w:t xml:space="preserve"> e</w:t>
+      </w:r>
+      <w:r>
+        <w:rPr>
+          <w:rFonts w:ascii="Times New Roman" w:eastAsia="Times New Roman" w:hAnsi="Times New Roman" w:cs="Times New Roman"/>
+          <w:sz w:val="24"/>
+          <w:szCs w:val="24"/>
+          <w:lang w:val="es-419" w:eastAsia="es-ES"/>
+        </w:rPr>
+        <w:t>n una sola base de datos y facilita la organización</w:t>
+      </w:r>
+      <w:r>
+        <w:rPr>
+          <w:rFonts w:ascii="Times New Roman" w:eastAsia="Times New Roman" w:hAnsi="Times New Roman" w:cs="Times New Roman"/>
+          <w:sz w:val="24"/>
+          <w:szCs w:val="24"/>
+          <w:lang w:val="es-419" w:eastAsia="es-ES"/>
+        </w:rPr>
+        <w:t xml:space="preserve"> </w:t>
+      </w:r>
+      <w:r>
+        <w:rPr>
+          <w:rFonts w:ascii="Times New Roman" w:eastAsia="Times New Roman" w:hAnsi="Times New Roman" w:cs="Times New Roman"/>
+          <w:sz w:val="24"/>
+          <w:szCs w:val="24"/>
+          <w:lang w:val="es-419" w:eastAsia="es-ES"/>
+        </w:rPr>
+        <w:t>de la información por ubicación</w:t>
+      </w:r>
+      <w:r>
+        <w:rPr>
+          <w:rFonts w:ascii="Times New Roman" w:eastAsia="Times New Roman" w:hAnsi="Times New Roman" w:cs="Times New Roman"/>
+          <w:sz w:val="24"/>
+          <w:szCs w:val="24"/>
+          <w:lang w:val="es-419" w:eastAsia="es-ES"/>
+        </w:rPr>
+        <w:t>.</w:t>
+      </w:r>
+      <w:r>
+        <w:rPr>
+          <w:rFonts w:ascii="Times New Roman" w:eastAsia="Times New Roman" w:hAnsi="Times New Roman" w:cs="Times New Roman"/>
+          <w:sz w:val="24"/>
+          <w:szCs w:val="24"/>
+          <w:lang w:val="es-419" w:eastAsia="es-ES"/>
+        </w:rPr>
+        <w:t xml:space="preserve"> También</w:t>
+      </w:r>
+      <w:r>
+        <w:rPr>
+          <w:rFonts w:ascii="Times New Roman" w:eastAsia="Times New Roman" w:hAnsi="Times New Roman" w:cs="Times New Roman"/>
+          <w:sz w:val="24"/>
+          <w:szCs w:val="24"/>
+          <w:lang w:val="es-419" w:eastAsia="es-ES"/>
+        </w:rPr>
+        <w:t xml:space="preserve"> permite realizar consultas globales combinando los datos mediante ope</w:t>
+      </w:r>
+      <w:r>
+        <w:rPr>
+          <w:rFonts w:ascii="Times New Roman" w:eastAsia="Times New Roman" w:hAnsi="Times New Roman" w:cs="Times New Roman"/>
+          <w:sz w:val="24"/>
+          <w:szCs w:val="24"/>
+          <w:lang w:val="es-419" w:eastAsia="es-ES"/>
+        </w:rPr>
+        <w:t>raciones como UNION.</w:t>
+      </w:r>
+    </w:p>
+    <w:p>
+      <w:pPr>
         <w:numPr>
           <w:ilvl w:val="0"/>
           <w:numId w:val="2"/>
@@ -3096,6 +3172,209 @@
           <w:lang w:eastAsia="es-ES"/>
         </w:rPr>
         <w:t>¿Qué desventajas identificas?</w:t>
+      </w:r>
+    </w:p>
+    <w:p>
+      <w:pPr>
+        <w:spacing w:before="100" w:beforeAutospacing="1" w:after="100" w:afterAutospacing="1" w:line="240" w:lineRule="auto"/>
+        <w:ind w:left="720"/>
+        <w:rPr>
+          <w:rFonts w:ascii="Times New Roman" w:eastAsia="Times New Roman" w:hAnsi="Times New Roman" w:cs="Times New Roman"/>
+          <w:sz w:val="24"/>
+          <w:szCs w:val="24"/>
+          <w:lang w:val="es-419" w:eastAsia="es-ES"/>
+        </w:rPr>
+      </w:pPr>
+      <w:r>
+        <w:rPr>
+          <w:rFonts w:ascii="Times New Roman" w:eastAsia="Times New Roman" w:hAnsi="Times New Roman" w:cs="Times New Roman"/>
+          <w:sz w:val="24"/>
+          <w:szCs w:val="24"/>
+          <w:lang w:eastAsia="es-ES"/>
+        </w:rPr>
+        <w:t xml:space="preserve">Respuesta: Una de las principales desventajas que he identificado es el aumento en la complejidad de </w:t>
+      </w:r>
+      <w:proofErr w:type="spellStart"/>
+      <w:r>
+        <w:rPr>
+          <w:rFonts w:ascii="Times New Roman" w:eastAsia="Times New Roman" w:hAnsi="Times New Roman" w:cs="Times New Roman"/>
+          <w:sz w:val="24"/>
+          <w:szCs w:val="24"/>
+          <w:lang w:eastAsia="es-ES"/>
+        </w:rPr>
+        <w:t>administraci</w:t>
+      </w:r>
+      <w:r>
+        <w:rPr>
+          <w:rFonts w:ascii="Times New Roman" w:eastAsia="Times New Roman" w:hAnsi="Times New Roman" w:cs="Times New Roman"/>
+          <w:sz w:val="24"/>
+          <w:szCs w:val="24"/>
+          <w:lang w:val="es-419" w:eastAsia="es-ES"/>
+        </w:rPr>
+        <w:t>ón</w:t>
+      </w:r>
+      <w:proofErr w:type="spellEnd"/>
+      <w:r>
+        <w:rPr>
+          <w:rFonts w:ascii="Times New Roman" w:eastAsia="Times New Roman" w:hAnsi="Times New Roman" w:cs="Times New Roman"/>
+          <w:sz w:val="24"/>
+          <w:szCs w:val="24"/>
+          <w:lang w:val="es-419" w:eastAsia="es-ES"/>
+        </w:rPr>
+        <w:t>,</w:t>
+      </w:r>
+      <w:r>
+        <w:rPr>
+          <w:rFonts w:ascii="Times New Roman" w:eastAsia="Times New Roman" w:hAnsi="Times New Roman" w:cs="Times New Roman"/>
+          <w:sz w:val="24"/>
+          <w:szCs w:val="24"/>
+          <w:lang w:val="es-419" w:eastAsia="es-ES"/>
+        </w:rPr>
+        <w:t xml:space="preserve"> ya que se deben manejar mú</w:t>
+      </w:r>
+      <w:r>
+        <w:rPr>
+          <w:rFonts w:ascii="Times New Roman" w:eastAsia="Times New Roman" w:hAnsi="Times New Roman" w:cs="Times New Roman"/>
+          <w:sz w:val="24"/>
+          <w:szCs w:val="24"/>
+          <w:lang w:val="es-419" w:eastAsia="es-ES"/>
+        </w:rPr>
+        <w:t>l</w:t>
+      </w:r>
+      <w:r>
+        <w:rPr>
+          <w:rFonts w:ascii="Times New Roman" w:eastAsia="Times New Roman" w:hAnsi="Times New Roman" w:cs="Times New Roman"/>
+          <w:sz w:val="24"/>
+          <w:szCs w:val="24"/>
+          <w:lang w:val="es-419" w:eastAsia="es-ES"/>
+        </w:rPr>
+        <w:t>tiples bases de datos. Tambié</w:t>
+      </w:r>
+      <w:r>
+        <w:rPr>
+          <w:rFonts w:ascii="Times New Roman" w:eastAsia="Times New Roman" w:hAnsi="Times New Roman" w:cs="Times New Roman"/>
+          <w:sz w:val="24"/>
+          <w:szCs w:val="24"/>
+          <w:lang w:val="es-419" w:eastAsia="es-ES"/>
+        </w:rPr>
+        <w:t>n puede haber dificultades al realizar consultas globales, ya qu</w:t>
+      </w:r>
+      <w:r>
+        <w:rPr>
+          <w:rFonts w:ascii="Times New Roman" w:eastAsia="Times New Roman" w:hAnsi="Times New Roman" w:cs="Times New Roman"/>
+          <w:sz w:val="24"/>
+          <w:szCs w:val="24"/>
+          <w:lang w:val="es-419" w:eastAsia="es-ES"/>
+        </w:rPr>
+        <w:t>e requieren combinar informació</w:t>
+      </w:r>
+      <w:r>
+        <w:rPr>
+          <w:rFonts w:ascii="Times New Roman" w:eastAsia="Times New Roman" w:hAnsi="Times New Roman" w:cs="Times New Roman"/>
+          <w:sz w:val="24"/>
+          <w:szCs w:val="24"/>
+          <w:lang w:val="es-419" w:eastAsia="es-ES"/>
+        </w:rPr>
+        <w:t>n</w:t>
+      </w:r>
+      <w:r>
+        <w:rPr>
+          <w:rFonts w:ascii="Times New Roman" w:eastAsia="Times New Roman" w:hAnsi="Times New Roman" w:cs="Times New Roman"/>
+          <w:sz w:val="24"/>
+          <w:szCs w:val="24"/>
+          <w:lang w:val="es-419" w:eastAsia="es-ES"/>
+        </w:rPr>
+        <w:t xml:space="preserve"> de distintas fuentes. Ademá</w:t>
+      </w:r>
+      <w:r>
+        <w:rPr>
+          <w:rFonts w:ascii="Times New Roman" w:eastAsia="Times New Roman" w:hAnsi="Times New Roman" w:cs="Times New Roman"/>
+          <w:sz w:val="24"/>
+          <w:szCs w:val="24"/>
+          <w:lang w:val="es-419" w:eastAsia="es-ES"/>
+        </w:rPr>
+        <w:t>s, exist</w:t>
+      </w:r>
+      <w:r>
+        <w:rPr>
+          <w:rFonts w:ascii="Times New Roman" w:eastAsia="Times New Roman" w:hAnsi="Times New Roman" w:cs="Times New Roman"/>
+          <w:sz w:val="24"/>
+          <w:szCs w:val="24"/>
+          <w:lang w:val="es-419" w:eastAsia="es-ES"/>
+        </w:rPr>
+        <w:t xml:space="preserve">e </w:t>
+      </w:r>
+      <w:r>
+        <w:rPr>
+          <w:rFonts w:ascii="Times New Roman" w:eastAsia="Times New Roman" w:hAnsi="Times New Roman" w:cs="Times New Roman"/>
+          <w:sz w:val="24"/>
+          <w:szCs w:val="24"/>
+          <w:lang w:val="es-419" w:eastAsia="es-ES"/>
+        </w:rPr>
+        <w:t>el Riesgo de inconsistencias o duplicaci</w:t>
+      </w:r>
+      <w:r>
+        <w:rPr>
+          <w:rFonts w:ascii="Times New Roman" w:eastAsia="Times New Roman" w:hAnsi="Times New Roman" w:cs="Times New Roman"/>
+          <w:sz w:val="24"/>
+          <w:szCs w:val="24"/>
+          <w:lang w:val="es-419" w:eastAsia="es-ES"/>
+        </w:rPr>
+        <w:t>ón</w:t>
+      </w:r>
+      <w:r>
+        <w:rPr>
+          <w:rFonts w:ascii="Times New Roman" w:eastAsia="Times New Roman" w:hAnsi="Times New Roman" w:cs="Times New Roman"/>
+          <w:sz w:val="24"/>
+          <w:szCs w:val="24"/>
+          <w:lang w:val="es-419" w:eastAsia="es-ES"/>
+        </w:rPr>
+        <w:t xml:space="preserve"> de d</w:t>
+      </w:r>
+      <w:r>
+        <w:rPr>
+          <w:rFonts w:ascii="Times New Roman" w:eastAsia="Times New Roman" w:hAnsi="Times New Roman" w:cs="Times New Roman"/>
+          <w:sz w:val="24"/>
+          <w:szCs w:val="24"/>
+          <w:lang w:val="es-419" w:eastAsia="es-ES"/>
+        </w:rPr>
+        <w:t>atos (por ejemplo, clientes o productos repetidos en ambas bases), y puede ser má</w:t>
+      </w:r>
+      <w:r>
+        <w:rPr>
+          <w:rFonts w:ascii="Times New Roman" w:eastAsia="Times New Roman" w:hAnsi="Times New Roman" w:cs="Times New Roman"/>
+          <w:sz w:val="24"/>
+          <w:szCs w:val="24"/>
+          <w:lang w:val="es-419" w:eastAsia="es-ES"/>
+        </w:rPr>
+        <w:t>s</w:t>
+      </w:r>
+      <w:r>
+        <w:rPr>
+          <w:rFonts w:ascii="Times New Roman" w:eastAsia="Times New Roman" w:hAnsi="Times New Roman" w:cs="Times New Roman"/>
+          <w:sz w:val="24"/>
+          <w:szCs w:val="24"/>
+          <w:lang w:val="es-419" w:eastAsia="es-ES"/>
+        </w:rPr>
+        <w:t xml:space="preserve"> complejo mantener la integridad y sincronización</w:t>
+      </w:r>
+      <w:r>
+        <w:rPr>
+          <w:rFonts w:ascii="Times New Roman" w:eastAsia="Times New Roman" w:hAnsi="Times New Roman" w:cs="Times New Roman"/>
+          <w:sz w:val="24"/>
+          <w:szCs w:val="24"/>
+          <w:lang w:val="es-419" w:eastAsia="es-ES"/>
+        </w:rPr>
+        <w:t xml:space="preserve"> </w:t>
+      </w:r>
+      <w:r>
+        <w:rPr>
+          <w:rFonts w:ascii="Times New Roman" w:eastAsia="Times New Roman" w:hAnsi="Times New Roman" w:cs="Times New Roman"/>
+          <w:sz w:val="24"/>
+          <w:szCs w:val="24"/>
+          <w:lang w:val="es-419" w:eastAsia="es-ES"/>
+        </w:rPr>
+        <w:t>del sistema.</w:t>
       </w:r>
     </w:p>
     <w:p/>
@@ -4239,6 +4518,7 @@
   <w:style w:type="character" w:default="1" w:styleId="DefaultParagraphFont">
     <w:name w:val="Default Paragraph Font"/>
     <w:uiPriority w:val="1"/>
+    <w:semiHidden/>
     <w:unhideWhenUsed/>
   </w:style>
   <w:style w:type="table" w:default="1" w:styleId="TableNormal">
@@ -4594,8 +4874,10 @@
   </w:compat>
   <w:rsids>
     <w:rsidRoot w:val="00D5038B"/>
+    <w:rsid w:val="000D48ED"/>
     <w:rsid w:val="003800D5"/>
     <w:rsid w:val="003C40C0"/>
+    <w:rsid w:val="00CF2195"/>
     <w:rsid w:val="00CF7DF7"/>
     <w:rsid w:val="00D5038B"/>
     <w:rsid w:val="00E70FB3"/>

</xml_diff>